<commit_message>
Final OEL submission - EDA complete with RFM analysis
</commit_message>
<xml_diff>
--- a/OEL_Proposal_ECommerce_Report.docx
+++ b/OEL_Proposal_ECommerce_Report.docx
@@ -78,8 +78,16 @@
       <w:pPr>
         <w:spacing w:before="40" w:after="400"/>
         <w:jc w:val="center"/>
-      </w:pPr>
-      <w:r>
+        <w:rPr>
+          <w:b/>
+          <w:bCs/>
+        </w:rPr>
+      </w:pPr>
+      <w:r>
+        <w:rPr>
+          <w:b/>
+          <w:bCs/>
+        </w:rPr>
         <w:t>Umar Muneer (75600)</w:t>
       </w:r>
     </w:p>
@@ -87,8 +95,16 @@
       <w:pPr>
         <w:spacing w:before="40" w:after="400"/>
         <w:jc w:val="center"/>
-      </w:pPr>
-      <w:r>
+        <w:rPr>
+          <w:b/>
+          <w:bCs/>
+        </w:rPr>
+      </w:pPr>
+      <w:r>
+        <w:rPr>
+          <w:b/>
+          <w:bCs/>
+        </w:rPr>
         <w:t>Hafiz Sharjeel Ali(75601)</w:t>
       </w:r>
     </w:p>
@@ -96,8 +112,16 @@
       <w:pPr>
         <w:spacing w:before="40" w:after="400"/>
         <w:jc w:val="center"/>
-      </w:pPr>
-      <w:r>
+        <w:rPr>
+          <w:b/>
+          <w:bCs/>
+        </w:rPr>
+      </w:pPr>
+      <w:r>
+        <w:rPr>
+          <w:b/>
+          <w:bCs/>
+        </w:rPr>
         <w:t>Muhammad Ali Raza (62696)</w:t>
       </w:r>
     </w:p>
@@ -105,10 +129,77 @@
       <w:pPr>
         <w:spacing w:before="40" w:after="400"/>
         <w:jc w:val="center"/>
-      </w:pPr>
-      <w:r>
+        <w:rPr>
+          <w:b/>
+          <w:bCs/>
+        </w:rPr>
+      </w:pPr>
+      <w:r>
+        <w:rPr>
+          <w:b/>
+          <w:bCs/>
+        </w:rPr>
         <w:t>Haider Hassan (68119)</w:t>
       </w:r>
+      <w:bookmarkStart w:id="0" w:name="_GoBack"/>
+      <w:bookmarkEnd w:id="0"/>
+    </w:p>
+    <w:p>
+      <w:pPr>
+        <w:spacing w:before="40" w:after="400"/>
+        <w:jc w:val="center"/>
+        <w:rPr>
+          <w:b/>
+          <w:bCs/>
+        </w:rPr>
+      </w:pPr>
+    </w:p>
+    <w:p>
+      <w:pPr>
+        <w:spacing w:before="40" w:after="400"/>
+        <w:jc w:val="center"/>
+        <w:rPr>
+          <w:b/>
+          <w:bCs/>
+        </w:rPr>
+      </w:pPr>
+      <w:r>
+        <w:rPr>
+          <w:b/>
+          <w:bCs/>
+        </w:rPr>
+        <w:t>My Github</w:t>
+      </w:r>
+    </w:p>
+    <w:p>
+      <w:pPr>
+        <w:spacing w:before="40" w:after="400"/>
+        <w:jc w:val="center"/>
+        <w:rPr>
+          <w:b/>
+          <w:bCs/>
+        </w:rPr>
+      </w:pPr>
+      <w:hyperlink r:id="rId5" w:history="1">
+        <w:r>
+          <w:rPr>
+            <w:rStyle w:val="Hyperlink"/>
+            <w:b/>
+            <w:bCs/>
+          </w:rPr>
+          <w:t>https://github.com/sharrjeel6636/OEL-Ecommerce-Analysis</w:t>
+        </w:r>
+      </w:hyperlink>
+    </w:p>
+    <w:p>
+      <w:pPr>
+        <w:spacing w:before="40" w:after="400"/>
+        <w:jc w:val="center"/>
+        <w:rPr>
+          <w:b/>
+          <w:bCs/>
+        </w:rPr>
+      </w:pPr>
     </w:p>
     <w:p>
       <w:pPr>
@@ -149,6 +240,44 @@
     </w:p>
     <w:p>
       <w:pPr>
+        <w:spacing w:before="80" w:after="80"/>
+      </w:pPr>
+    </w:p>
+    <w:p>
+      <w:pPr>
+        <w:spacing w:before="80" w:after="80"/>
+        <w:rPr>
+          <w:b/>
+          <w:bCs/>
+        </w:rPr>
+      </w:pPr>
+      <w:r>
+        <w:rPr>
+          <w:b/>
+          <w:bCs/>
+        </w:rPr>
+        <w:t>DataSet</w:t>
+      </w:r>
+      <w:r>
+        <w:rPr>
+          <w:b/>
+          <w:bCs/>
+        </w:rPr>
+        <w:t xml:space="preserve">: </w:t>
+      </w:r>
+      <w:hyperlink r:id="rId6" w:history="1">
+        <w:r>
+          <w:rPr>
+            <w:rStyle w:val="Hyperlink"/>
+            <w:b/>
+            <w:bCs/>
+          </w:rPr>
+          <w:t>https://www.kaggle.com/datasets/carrie1/ecommerce-data?resource=download</w:t>
+        </w:r>
+      </w:hyperlink>
+    </w:p>
+    <w:p>
+      <w:pPr>
         <w:pStyle w:val="Heading1"/>
         <w:spacing w:before="300" w:after="120"/>
       </w:pPr>
@@ -423,6 +552,7 @@
           <w:sz w:val="24"/>
           <w:szCs w:val="24"/>
         </w:rPr>
+        <w:lastRenderedPageBreak/>
         <w:t>5.1  Data Collection</w:t>
       </w:r>
     </w:p>
@@ -449,7 +579,6 @@
         <w:spacing w:before="60" w:after="60"/>
       </w:pPr>
       <w:r>
-        <w:lastRenderedPageBreak/>
         <w:t>Columns: InvoiceNo, StockCode, Description, Quantity, InvoiceDate, UnitPrice, CustomerID, Country</w:t>
       </w:r>
     </w:p>
@@ -801,7 +930,7 @@
                     <pic:cNvPicPr/>
                   </pic:nvPicPr>
                   <pic:blipFill>
-                    <a:blip r:embed="rId5" cstate="print">
+                    <a:blip r:embed="rId7" cstate="print">
                       <a:extLst>
                         <a:ext uri="{28A0092B-C50C-407E-A947-70E740481C1C}">
                           <a14:useLocalDpi xmlns:a14="http://schemas.microsoft.com/office/drawing/2010/main" val="0"/>
@@ -1880,8 +2009,6 @@
       <w:pPr>
         <w:spacing w:before="60" w:after="60"/>
       </w:pPr>
-      <w:bookmarkStart w:id="0" w:name="_GoBack"/>
-      <w:bookmarkEnd w:id="0"/>
     </w:p>
     <w:p>
       <w:pPr>
@@ -2349,396 +2476,6 @@
             <wp:extent cx="6172200" cy="2814320"/>
             <wp:effectExtent l="0" t="0" r="0" b="5080"/>
             <wp:docPr id="13" name="Picture 13"/>
-            <wp:cNvGraphicFramePr>
-              <a:graphicFrameLocks xmlns:a="http://schemas.openxmlformats.org/drawingml/2006/main" noChangeAspect="1"/>
-            </wp:cNvGraphicFramePr>
-            <a:graphic xmlns:a="http://schemas.openxmlformats.org/drawingml/2006/main">
-              <a:graphicData uri="http://schemas.openxmlformats.org/drawingml/2006/picture">
-                <pic:pic xmlns:pic="http://schemas.openxmlformats.org/drawingml/2006/picture">
-                  <pic:nvPicPr>
-                    <pic:cNvPr id="1" name=""/>
-                    <pic:cNvPicPr/>
-                  </pic:nvPicPr>
-                  <pic:blipFill>
-                    <a:blip r:embed="rId6"/>
-                    <a:stretch>
-                      <a:fillRect/>
-                    </a:stretch>
-                  </pic:blipFill>
-                  <pic:spPr>
-                    <a:xfrm>
-                      <a:off x="0" y="0"/>
-                      <a:ext cx="6172200" cy="2814320"/>
-                    </a:xfrm>
-                    <a:prstGeom prst="rect">
-                      <a:avLst/>
-                    </a:prstGeom>
-                  </pic:spPr>
-                </pic:pic>
-              </a:graphicData>
-            </a:graphic>
-          </wp:inline>
-        </w:drawing>
-      </w:r>
-    </w:p>
-    <w:p>
-      <w:pPr>
-        <w:spacing w:before="60" w:after="60"/>
-      </w:pPr>
-    </w:p>
-    <w:p>
-      <w:pPr>
-        <w:spacing w:before="60" w:after="60"/>
-      </w:pPr>
-      <w:r>
-        <w:t>monthly = (</w:t>
-      </w:r>
-    </w:p>
-    <w:p>
-      <w:pPr>
-        <w:spacing w:before="60" w:after="60"/>
-      </w:pPr>
-      <w:r>
-        <w:t xml:space="preserve">    df.groupby(['Year','Month'])['Revenue']</w:t>
-      </w:r>
-    </w:p>
-    <w:p>
-      <w:pPr>
-        <w:spacing w:before="60" w:after="60"/>
-      </w:pPr>
-      <w:r>
-        <w:t xml:space="preserve">    .sum()</w:t>
-      </w:r>
-    </w:p>
-    <w:p>
-      <w:pPr>
-        <w:spacing w:before="60" w:after="60"/>
-      </w:pPr>
-      <w:r>
-        <w:t xml:space="preserve">    .reset_index()</w:t>
-      </w:r>
-    </w:p>
-    <w:p>
-      <w:pPr>
-        <w:spacing w:before="60" w:after="60"/>
-      </w:pPr>
-      <w:r>
-        <w:t>)</w:t>
-      </w:r>
-    </w:p>
-    <w:p>
-      <w:pPr>
-        <w:spacing w:before="60" w:after="60"/>
-      </w:pPr>
-      <w:r>
-        <w:t>monthly['Period'] = monthly['Year'].astype(str) + '-' + monthly['Month'].astype(str).str.zfill(2)</w:t>
-      </w:r>
-    </w:p>
-    <w:p>
-      <w:pPr>
-        <w:spacing w:before="60" w:after="60"/>
-      </w:pPr>
-      <w:r>
-        <w:t>monthly.sort_values('Period', inplace=True)</w:t>
-      </w:r>
-    </w:p>
-    <w:p>
-      <w:pPr>
-        <w:spacing w:before="60" w:after="60"/>
-      </w:pPr>
-    </w:p>
-    <w:p>
-      <w:pPr>
-        <w:spacing w:before="60" w:after="60"/>
-      </w:pPr>
-      <w:r>
-        <w:t>plt.figure(figsize=(14, 5))</w:t>
-      </w:r>
-    </w:p>
-    <w:p>
-      <w:pPr>
-        <w:spacing w:before="60" w:after="60"/>
-      </w:pPr>
-      <w:r>
-        <w:t>plt.plot(monthly['Period'], monthly['Revenue'], marker='o', color='steelblue', linewidth=2)</w:t>
-      </w:r>
-    </w:p>
-    <w:p>
-      <w:pPr>
-        <w:spacing w:before="60" w:after="60"/>
-      </w:pPr>
-      <w:r>
-        <w:t>plt.fill_between(monthly['Period'], monthly['Revenue'], alpha=0.15, color='steelblue')</w:t>
-      </w:r>
-    </w:p>
-    <w:p>
-      <w:pPr>
-        <w:spacing w:before="60" w:after="60"/>
-      </w:pPr>
-      <w:r>
-        <w:t>plt.title('Monthly Revenue Trend', fontsize=15, fontweight='bold')</w:t>
-      </w:r>
-    </w:p>
-    <w:p>
-      <w:pPr>
-        <w:spacing w:before="60" w:after="60"/>
-      </w:pPr>
-      <w:r>
-        <w:t>plt.xlabel('Month')</w:t>
-      </w:r>
-    </w:p>
-    <w:p>
-      <w:pPr>
-        <w:spacing w:before="60" w:after="60"/>
-      </w:pPr>
-      <w:r>
-        <w:t>plt.ylabel('Total Revenue (£)')</w:t>
-      </w:r>
-    </w:p>
-    <w:p>
-      <w:pPr>
-        <w:spacing w:before="60" w:after="60"/>
-      </w:pPr>
-      <w:r>
-        <w:t>plt.xticks(rotation=45)</w:t>
-      </w:r>
-    </w:p>
-    <w:p>
-      <w:pPr>
-        <w:spacing w:before="60" w:after="60"/>
-      </w:pPr>
-      <w:r>
-        <w:t>plt.tight_layout()</w:t>
-      </w:r>
-    </w:p>
-    <w:p>
-      <w:pPr>
-        <w:spacing w:before="60" w:after="60"/>
-      </w:pPr>
-      <w:r>
-        <w:t>plt.show()</w:t>
-      </w:r>
-    </w:p>
-    <w:p>
-      <w:pPr>
-        <w:spacing w:before="60" w:after="60"/>
-      </w:pPr>
-      <w:r>
-        <w:lastRenderedPageBreak/>
-        <w:drawing>
-          <wp:inline distT="0" distB="0" distL="0" distR="0" wp14:anchorId="3FDDAE39" wp14:editId="6E71FE44">
-            <wp:extent cx="6172200" cy="2168525"/>
-            <wp:effectExtent l="0" t="0" r="0" b="3175"/>
-            <wp:docPr id="11" name="Picture 11"/>
-            <wp:cNvGraphicFramePr>
-              <a:graphicFrameLocks xmlns:a="http://schemas.openxmlformats.org/drawingml/2006/main" noChangeAspect="1"/>
-            </wp:cNvGraphicFramePr>
-            <a:graphic xmlns:a="http://schemas.openxmlformats.org/drawingml/2006/main">
-              <a:graphicData uri="http://schemas.openxmlformats.org/drawingml/2006/picture">
-                <pic:pic xmlns:pic="http://schemas.openxmlformats.org/drawingml/2006/picture">
-                  <pic:nvPicPr>
-                    <pic:cNvPr id="1" name=""/>
-                    <pic:cNvPicPr/>
-                  </pic:nvPicPr>
-                  <pic:blipFill>
-                    <a:blip r:embed="rId7"/>
-                    <a:stretch>
-                      <a:fillRect/>
-                    </a:stretch>
-                  </pic:blipFill>
-                  <pic:spPr>
-                    <a:xfrm>
-                      <a:off x="0" y="0"/>
-                      <a:ext cx="6172200" cy="2168525"/>
-                    </a:xfrm>
-                    <a:prstGeom prst="rect">
-                      <a:avLst/>
-                    </a:prstGeom>
-                  </pic:spPr>
-                </pic:pic>
-              </a:graphicData>
-            </a:graphic>
-          </wp:inline>
-        </w:drawing>
-      </w:r>
-    </w:p>
-    <w:p>
-      <w:pPr>
-        <w:spacing w:before="60" w:after="60"/>
-      </w:pPr>
-    </w:p>
-    <w:p>
-      <w:pPr>
-        <w:spacing w:before="60" w:after="60"/>
-      </w:pPr>
-      <w:r>
-        <w:t>regional = (</w:t>
-      </w:r>
-    </w:p>
-    <w:p>
-      <w:pPr>
-        <w:spacing w:before="60" w:after="60"/>
-      </w:pPr>
-      <w:r>
-        <w:t xml:space="preserve">    df.groupby('Country')['Revenue']</w:t>
-      </w:r>
-    </w:p>
-    <w:p>
-      <w:pPr>
-        <w:spacing w:before="60" w:after="60"/>
-      </w:pPr>
-      <w:r>
-        <w:t xml:space="preserve">    .sum()</w:t>
-      </w:r>
-    </w:p>
-    <w:p>
-      <w:pPr>
-        <w:spacing w:before="60" w:after="60"/>
-      </w:pPr>
-      <w:r>
-        <w:t xml:space="preserve">    .sort_values(ascending=False)</w:t>
-      </w:r>
-    </w:p>
-    <w:p>
-      <w:pPr>
-        <w:spacing w:before="60" w:after="60"/>
-      </w:pPr>
-      <w:r>
-        <w:t xml:space="preserve">    .head(10)</w:t>
-      </w:r>
-    </w:p>
-    <w:p>
-      <w:pPr>
-        <w:spacing w:before="60" w:after="60"/>
-      </w:pPr>
-      <w:r>
-        <w:t>)</w:t>
-      </w:r>
-    </w:p>
-    <w:p>
-      <w:pPr>
-        <w:spacing w:before="60" w:after="60"/>
-      </w:pPr>
-    </w:p>
-    <w:p>
-      <w:pPr>
-        <w:spacing w:before="60" w:after="60"/>
-      </w:pPr>
-      <w:r>
-        <w:t>fig, axes = plt.subplots(1, 2, figsize=(16, 6))</w:t>
-      </w:r>
-    </w:p>
-    <w:p>
-      <w:pPr>
-        <w:spacing w:before="60" w:after="60"/>
-      </w:pPr>
-    </w:p>
-    <w:p>
-      <w:pPr>
-        <w:spacing w:before="60" w:after="60"/>
-      </w:pPr>
-      <w:r>
-        <w:t># Bar chart</w:t>
-      </w:r>
-    </w:p>
-    <w:p>
-      <w:pPr>
-        <w:spacing w:before="60" w:after="60"/>
-      </w:pPr>
-      <w:r>
-        <w:t>sns.barplot(x=regional.values, y=regional.index, palette='viridis', ax=axes[0])</w:t>
-      </w:r>
-    </w:p>
-    <w:p>
-      <w:pPr>
-        <w:spacing w:before="60" w:after="60"/>
-      </w:pPr>
-      <w:r>
-        <w:t>axes[0].set_title('Top 10 Countries by Revenue', fontweight='bold')</w:t>
-      </w:r>
-    </w:p>
-    <w:p>
-      <w:pPr>
-        <w:spacing w:before="60" w:after="60"/>
-      </w:pPr>
-      <w:r>
-        <w:t>axes[0].set_xlabel('Revenue (£)')</w:t>
-      </w:r>
-    </w:p>
-    <w:p>
-      <w:pPr>
-        <w:spacing w:before="60" w:after="60"/>
-      </w:pPr>
-    </w:p>
-    <w:p>
-      <w:pPr>
-        <w:spacing w:before="60" w:after="60"/>
-      </w:pPr>
-      <w:r>
-        <w:t># Pie chart</w:t>
-      </w:r>
-    </w:p>
-    <w:p>
-      <w:pPr>
-        <w:spacing w:before="60" w:after="60"/>
-      </w:pPr>
-      <w:r>
-        <w:t>axes[1].pie(regional.values, labels=regional.index, autopct='%1.1f%%',</w:t>
-      </w:r>
-    </w:p>
-    <w:p>
-      <w:pPr>
-        <w:spacing w:before="60" w:after="60"/>
-      </w:pPr>
-      <w:r>
-        <w:t xml:space="preserve">            startangle=140, colors=sns.color_palette('viridis', len(regional)))</w:t>
-      </w:r>
-    </w:p>
-    <w:p>
-      <w:pPr>
-        <w:spacing w:before="60" w:after="60"/>
-      </w:pPr>
-      <w:r>
-        <w:t>axes[1].set_title('Revenue Share by Country', fontweight='bold')</w:t>
-      </w:r>
-    </w:p>
-    <w:p>
-      <w:pPr>
-        <w:spacing w:before="60" w:after="60"/>
-      </w:pPr>
-    </w:p>
-    <w:p>
-      <w:pPr>
-        <w:spacing w:before="60" w:after="60"/>
-      </w:pPr>
-      <w:r>
-        <w:t>plt.tight_layout()</w:t>
-      </w:r>
-    </w:p>
-    <w:p>
-      <w:pPr>
-        <w:spacing w:before="60" w:after="60"/>
-      </w:pPr>
-      <w:r>
-        <w:t>plt.show()</w:t>
-      </w:r>
-    </w:p>
-    <w:p>
-      <w:pPr>
-        <w:spacing w:before="60" w:after="60"/>
-      </w:pPr>
-    </w:p>
-    <w:p>
-      <w:pPr>
-        <w:spacing w:before="60" w:after="60"/>
-      </w:pPr>
-      <w:r>
-        <w:lastRenderedPageBreak/>
-        <w:drawing>
-          <wp:inline distT="0" distB="0" distL="0" distR="0" wp14:anchorId="12B22C00" wp14:editId="599F4AD8">
-            <wp:extent cx="6172200" cy="2444750"/>
-            <wp:effectExtent l="0" t="0" r="0" b="0"/>
-            <wp:docPr id="10" name="Picture 10"/>
             <wp:cNvGraphicFramePr>
               <a:graphicFrameLocks xmlns:a="http://schemas.openxmlformats.org/drawingml/2006/main" noChangeAspect="1"/>
             </wp:cNvGraphicFramePr>
@@ -2758,7 +2495,7 @@
                   <pic:spPr>
                     <a:xfrm>
                       <a:off x="0" y="0"/>
-                      <a:ext cx="6172200" cy="2444750"/>
+                      <a:ext cx="6172200" cy="2814320"/>
                     </a:xfrm>
                     <a:prstGeom prst="rect">
                       <a:avLst/>
@@ -2781,36 +2518,116 @@
         <w:spacing w:before="60" w:after="60"/>
       </w:pPr>
       <w:r>
-        <w:t>corr = df[['Quantity','UnitPrice','Revenue']].corr()</w:t>
-      </w:r>
-    </w:p>
-    <w:p>
-      <w:pPr>
-        <w:spacing w:before="60" w:after="60"/>
-      </w:pPr>
-    </w:p>
-    <w:p>
-      <w:pPr>
-        <w:spacing w:before="60" w:after="60"/>
-      </w:pPr>
-      <w:r>
-        <w:t>plt.figure(figsize=(7, 5))</w:t>
-      </w:r>
-    </w:p>
-    <w:p>
-      <w:pPr>
-        <w:spacing w:before="60" w:after="60"/>
-      </w:pPr>
-      <w:r>
-        <w:t>sns.heatmap(corr, annot=True, fmt='.2f', cmap='coolwarm', linewidths=0.5)</w:t>
-      </w:r>
-    </w:p>
-    <w:p>
-      <w:pPr>
-        <w:spacing w:before="60" w:after="60"/>
-      </w:pPr>
-      <w:r>
-        <w:t>plt.title('Correlation Heatmap', fontsize=14, fontweight='bold')</w:t>
+        <w:t>monthly = (</w:t>
+      </w:r>
+    </w:p>
+    <w:p>
+      <w:pPr>
+        <w:spacing w:before="60" w:after="60"/>
+      </w:pPr>
+      <w:r>
+        <w:t xml:space="preserve">    df.groupby(['Year','Month'])['Revenue']</w:t>
+      </w:r>
+    </w:p>
+    <w:p>
+      <w:pPr>
+        <w:spacing w:before="60" w:after="60"/>
+      </w:pPr>
+      <w:r>
+        <w:t xml:space="preserve">    .sum()</w:t>
+      </w:r>
+    </w:p>
+    <w:p>
+      <w:pPr>
+        <w:spacing w:before="60" w:after="60"/>
+      </w:pPr>
+      <w:r>
+        <w:t xml:space="preserve">    .reset_index()</w:t>
+      </w:r>
+    </w:p>
+    <w:p>
+      <w:pPr>
+        <w:spacing w:before="60" w:after="60"/>
+      </w:pPr>
+      <w:r>
+        <w:t>)</w:t>
+      </w:r>
+    </w:p>
+    <w:p>
+      <w:pPr>
+        <w:spacing w:before="60" w:after="60"/>
+      </w:pPr>
+      <w:r>
+        <w:t>monthly['Period'] = monthly['Year'].astype(str) + '-' + monthly['Month'].astype(str).str.zfill(2)</w:t>
+      </w:r>
+    </w:p>
+    <w:p>
+      <w:pPr>
+        <w:spacing w:before="60" w:after="60"/>
+      </w:pPr>
+      <w:r>
+        <w:t>monthly.sort_values('Period', inplace=True)</w:t>
+      </w:r>
+    </w:p>
+    <w:p>
+      <w:pPr>
+        <w:spacing w:before="60" w:after="60"/>
+      </w:pPr>
+    </w:p>
+    <w:p>
+      <w:pPr>
+        <w:spacing w:before="60" w:after="60"/>
+      </w:pPr>
+      <w:r>
+        <w:t>plt.figure(figsize=(14, 5))</w:t>
+      </w:r>
+    </w:p>
+    <w:p>
+      <w:pPr>
+        <w:spacing w:before="60" w:after="60"/>
+      </w:pPr>
+      <w:r>
+        <w:t>plt.plot(monthly['Period'], monthly['Revenue'], marker='o', color='steelblue', linewidth=2)</w:t>
+      </w:r>
+    </w:p>
+    <w:p>
+      <w:pPr>
+        <w:spacing w:before="60" w:after="60"/>
+      </w:pPr>
+      <w:r>
+        <w:t>plt.fill_between(monthly['Period'], monthly['Revenue'], alpha=0.15, color='steelblue')</w:t>
+      </w:r>
+    </w:p>
+    <w:p>
+      <w:pPr>
+        <w:spacing w:before="60" w:after="60"/>
+      </w:pPr>
+      <w:r>
+        <w:t>plt.title('Monthly Revenue Trend', fontsize=15, fontweight='bold')</w:t>
+      </w:r>
+    </w:p>
+    <w:p>
+      <w:pPr>
+        <w:spacing w:before="60" w:after="60"/>
+      </w:pPr>
+      <w:r>
+        <w:t>plt.xlabel('Month')</w:t>
+      </w:r>
+    </w:p>
+    <w:p>
+      <w:pPr>
+        <w:spacing w:before="60" w:after="60"/>
+      </w:pPr>
+      <w:r>
+        <w:t>plt.ylabel('Total Revenue (£)')</w:t>
+      </w:r>
+    </w:p>
+    <w:p>
+      <w:pPr>
+        <w:spacing w:before="60" w:after="60"/>
+      </w:pPr>
+      <w:r>
+        <w:t>plt.xticks(rotation=45)</w:t>
       </w:r>
     </w:p>
     <w:p>
@@ -2828,11 +2645,6 @@
       <w:r>
         <w:t>plt.show()</w:t>
       </w:r>
-    </w:p>
-    <w:p>
-      <w:pPr>
-        <w:spacing w:before="60" w:after="60"/>
-      </w:pPr>
     </w:p>
     <w:p>
       <w:pPr>
@@ -2841,10 +2653,10 @@
       <w:r>
         <w:lastRenderedPageBreak/>
         <w:drawing>
-          <wp:inline distT="0" distB="0" distL="0" distR="0" wp14:anchorId="332D4214" wp14:editId="7AAAE02D">
-            <wp:extent cx="6172200" cy="4535170"/>
-            <wp:effectExtent l="0" t="0" r="0" b="0"/>
-            <wp:docPr id="9" name="Picture 9"/>
+          <wp:inline distT="0" distB="0" distL="0" distR="0" wp14:anchorId="3FDDAE39" wp14:editId="6E71FE44">
+            <wp:extent cx="6172200" cy="2168525"/>
+            <wp:effectExtent l="0" t="0" r="0" b="3175"/>
+            <wp:docPr id="11" name="Picture 11"/>
             <wp:cNvGraphicFramePr>
               <a:graphicFrameLocks xmlns:a="http://schemas.openxmlformats.org/drawingml/2006/main" noChangeAspect="1"/>
             </wp:cNvGraphicFramePr>
@@ -2864,7 +2676,7 @@
                   <pic:spPr>
                     <a:xfrm>
                       <a:off x="0" y="0"/>
-                      <a:ext cx="6172200" cy="4535170"/>
+                      <a:ext cx="6172200" cy="2168525"/>
                     </a:xfrm>
                     <a:prstGeom prst="rect">
                       <a:avLst/>
@@ -2886,100 +2698,135 @@
       <w:pPr>
         <w:spacing w:before="60" w:after="60"/>
       </w:pPr>
-    </w:p>
-    <w:p>
-      <w:pPr>
-        <w:spacing w:before="60" w:after="60"/>
-      </w:pPr>
-      <w:r>
-        <w:t>fig, axes = plt.subplots(1, 2, figsize=(14, 5))</w:t>
-      </w:r>
-    </w:p>
-    <w:p>
-      <w:pPr>
-        <w:spacing w:before="60" w:after="60"/>
-      </w:pPr>
-    </w:p>
-    <w:p>
-      <w:pPr>
-        <w:spacing w:before="60" w:after="60"/>
-      </w:pPr>
-      <w:r>
-        <w:t># Cap at 99th percentile for visibility</w:t>
-      </w:r>
-    </w:p>
-    <w:p>
-      <w:pPr>
-        <w:spacing w:before="60" w:after="60"/>
-      </w:pPr>
-      <w:r>
-        <w:t>rev_cap = df['Revenue'].clip(upper=df['Revenue'].quantile(0.99))</w:t>
-      </w:r>
-    </w:p>
-    <w:p>
-      <w:pPr>
-        <w:spacing w:before="60" w:after="60"/>
-      </w:pPr>
-      <w:r>
-        <w:t>qty_cap = df['Quantity'].clip(upper=df['Quantity'].quantile(0.99))</w:t>
-      </w:r>
-    </w:p>
-    <w:p>
-      <w:pPr>
-        <w:spacing w:before="60" w:after="60"/>
-      </w:pPr>
-    </w:p>
-    <w:p>
-      <w:pPr>
-        <w:spacing w:before="60" w:after="60"/>
-      </w:pPr>
-      <w:r>
-        <w:t>sns.boxplot(y=rev_cap, ax=axes[0], color='lightcoral')</w:t>
-      </w:r>
-    </w:p>
-    <w:p>
-      <w:pPr>
-        <w:spacing w:before="60" w:after="60"/>
-      </w:pPr>
-      <w:r>
-        <w:t>axes[0].set_title('Revenue Distribution (Box Plot)', fontweight='bold')</w:t>
-      </w:r>
-    </w:p>
-    <w:p>
-      <w:pPr>
-        <w:spacing w:before="60" w:after="60"/>
-      </w:pPr>
-      <w:r>
-        <w:t>axes[0].set_ylabel('Revenue (£)')</w:t>
-      </w:r>
-    </w:p>
-    <w:p>
-      <w:pPr>
-        <w:spacing w:before="60" w:after="60"/>
-      </w:pPr>
-    </w:p>
-    <w:p>
-      <w:pPr>
-        <w:spacing w:before="60" w:after="60"/>
-      </w:pPr>
-      <w:r>
-        <w:t>sns.boxplot(y=qty_cap, ax=axes[1], color='lightblue')</w:t>
-      </w:r>
-    </w:p>
-    <w:p>
-      <w:pPr>
-        <w:spacing w:before="60" w:after="60"/>
-      </w:pPr>
-      <w:r>
-        <w:t>axes[1].set_title('Quantity Distribution (Box Plot)', fontweight='bold')</w:t>
-      </w:r>
-    </w:p>
-    <w:p>
-      <w:pPr>
-        <w:spacing w:before="60" w:after="60"/>
-      </w:pPr>
-      <w:r>
-        <w:t>axes[1].set_ylabel('Quantity')</w:t>
+      <w:r>
+        <w:t>regional = (</w:t>
+      </w:r>
+    </w:p>
+    <w:p>
+      <w:pPr>
+        <w:spacing w:before="60" w:after="60"/>
+      </w:pPr>
+      <w:r>
+        <w:t xml:space="preserve">    df.groupby('Country')['Revenue']</w:t>
+      </w:r>
+    </w:p>
+    <w:p>
+      <w:pPr>
+        <w:spacing w:before="60" w:after="60"/>
+      </w:pPr>
+      <w:r>
+        <w:t xml:space="preserve">    .sum()</w:t>
+      </w:r>
+    </w:p>
+    <w:p>
+      <w:pPr>
+        <w:spacing w:before="60" w:after="60"/>
+      </w:pPr>
+      <w:r>
+        <w:t xml:space="preserve">    .sort_values(ascending=False)</w:t>
+      </w:r>
+    </w:p>
+    <w:p>
+      <w:pPr>
+        <w:spacing w:before="60" w:after="60"/>
+      </w:pPr>
+      <w:r>
+        <w:t xml:space="preserve">    .head(10)</w:t>
+      </w:r>
+    </w:p>
+    <w:p>
+      <w:pPr>
+        <w:spacing w:before="60" w:after="60"/>
+      </w:pPr>
+      <w:r>
+        <w:t>)</w:t>
+      </w:r>
+    </w:p>
+    <w:p>
+      <w:pPr>
+        <w:spacing w:before="60" w:after="60"/>
+      </w:pPr>
+    </w:p>
+    <w:p>
+      <w:pPr>
+        <w:spacing w:before="60" w:after="60"/>
+      </w:pPr>
+      <w:r>
+        <w:t>fig, axes = plt.subplots(1, 2, figsize=(16, 6))</w:t>
+      </w:r>
+    </w:p>
+    <w:p>
+      <w:pPr>
+        <w:spacing w:before="60" w:after="60"/>
+      </w:pPr>
+    </w:p>
+    <w:p>
+      <w:pPr>
+        <w:spacing w:before="60" w:after="60"/>
+      </w:pPr>
+      <w:r>
+        <w:t># Bar chart</w:t>
+      </w:r>
+    </w:p>
+    <w:p>
+      <w:pPr>
+        <w:spacing w:before="60" w:after="60"/>
+      </w:pPr>
+      <w:r>
+        <w:t>sns.barplot(x=regional.values, y=regional.index, palette='viridis', ax=axes[0])</w:t>
+      </w:r>
+    </w:p>
+    <w:p>
+      <w:pPr>
+        <w:spacing w:before="60" w:after="60"/>
+      </w:pPr>
+      <w:r>
+        <w:t>axes[0].set_title('Top 10 Countries by Revenue', fontweight='bold')</w:t>
+      </w:r>
+    </w:p>
+    <w:p>
+      <w:pPr>
+        <w:spacing w:before="60" w:after="60"/>
+      </w:pPr>
+      <w:r>
+        <w:t>axes[0].set_xlabel('Revenue (£)')</w:t>
+      </w:r>
+    </w:p>
+    <w:p>
+      <w:pPr>
+        <w:spacing w:before="60" w:after="60"/>
+      </w:pPr>
+    </w:p>
+    <w:p>
+      <w:pPr>
+        <w:spacing w:before="60" w:after="60"/>
+      </w:pPr>
+      <w:r>
+        <w:t># Pie chart</w:t>
+      </w:r>
+    </w:p>
+    <w:p>
+      <w:pPr>
+        <w:spacing w:before="60" w:after="60"/>
+      </w:pPr>
+      <w:r>
+        <w:t>axes[1].pie(regional.values, labels=regional.index, autopct='%1.1f%%',</w:t>
+      </w:r>
+    </w:p>
+    <w:p>
+      <w:pPr>
+        <w:spacing w:before="60" w:after="60"/>
+      </w:pPr>
+      <w:r>
+        <w:t xml:space="preserve">            startangle=140, colors=sns.color_palette('viridis', len(regional)))</w:t>
+      </w:r>
+    </w:p>
+    <w:p>
+      <w:pPr>
+        <w:spacing w:before="60" w:after="60"/>
+      </w:pPr>
+      <w:r>
+        <w:t>axes[1].set_title('Revenue Share by Country', fontweight='bold')</w:t>
       </w:r>
     </w:p>
     <w:p>
@@ -3013,11 +2860,12 @@
         <w:spacing w:before="60" w:after="60"/>
       </w:pPr>
       <w:r>
+        <w:lastRenderedPageBreak/>
         <w:drawing>
-          <wp:inline distT="0" distB="0" distL="0" distR="0" wp14:anchorId="56F70862" wp14:editId="01F3ED0F">
-            <wp:extent cx="6172200" cy="2205990"/>
-            <wp:effectExtent l="0" t="0" r="0" b="3810"/>
-            <wp:docPr id="8" name="Picture 8"/>
+          <wp:inline distT="0" distB="0" distL="0" distR="0" wp14:anchorId="12B22C00" wp14:editId="599F4AD8">
+            <wp:extent cx="6172200" cy="2444750"/>
+            <wp:effectExtent l="0" t="0" r="0" b="0"/>
+            <wp:docPr id="10" name="Picture 10"/>
             <wp:cNvGraphicFramePr>
               <a:graphicFrameLocks xmlns:a="http://schemas.openxmlformats.org/drawingml/2006/main" noChangeAspect="1"/>
             </wp:cNvGraphicFramePr>
@@ -3037,7 +2885,7 @@
                   <pic:spPr>
                     <a:xfrm>
                       <a:off x="0" y="0"/>
-                      <a:ext cx="6172200" cy="2205990"/>
+                      <a:ext cx="6172200" cy="2444750"/>
                     </a:xfrm>
                     <a:prstGeom prst="rect">
                       <a:avLst/>
@@ -3060,60 +2908,36 @@
         <w:spacing w:before="60" w:after="60"/>
       </w:pPr>
       <w:r>
-        <w:t>day_order = ['Monday','Tuesday','Wednesday','Thursday','Friday','Saturday','Sunday']</w:t>
-      </w:r>
-    </w:p>
-    <w:p>
-      <w:pPr>
-        <w:spacing w:before="60" w:after="60"/>
-      </w:pPr>
-      <w:r>
-        <w:t>day_sales = df.groupby('DayOfWeek')['Revenue'].sum().reindex(day_order)</w:t>
-      </w:r>
-    </w:p>
-    <w:p>
-      <w:pPr>
-        <w:spacing w:before="60" w:after="60"/>
-      </w:pPr>
-    </w:p>
-    <w:p>
-      <w:pPr>
-        <w:spacing w:before="60" w:after="60"/>
-      </w:pPr>
-      <w:r>
-        <w:t>plt.figure(figsize=(10, 5))</w:t>
-      </w:r>
-    </w:p>
-    <w:p>
-      <w:pPr>
-        <w:spacing w:before="60" w:after="60"/>
-      </w:pPr>
-      <w:r>
-        <w:t>sns.barplot(x=day_sales.index, y=day_sales.values, palette='Set2')</w:t>
-      </w:r>
-    </w:p>
-    <w:p>
-      <w:pPr>
-        <w:spacing w:before="60" w:after="60"/>
-      </w:pPr>
-      <w:r>
-        <w:t>plt.title('Revenue by Day of Week', fontsize=14, fontweight='bold')</w:t>
-      </w:r>
-    </w:p>
-    <w:p>
-      <w:pPr>
-        <w:spacing w:before="60" w:after="60"/>
-      </w:pPr>
-      <w:r>
-        <w:t>plt.xlabel('Day')</w:t>
-      </w:r>
-    </w:p>
-    <w:p>
-      <w:pPr>
-        <w:spacing w:before="60" w:after="60"/>
-      </w:pPr>
-      <w:r>
-        <w:t>plt.ylabel('Total Revenue (£)')</w:t>
+        <w:t>corr = df[['Quantity','UnitPrice','Revenue']].corr()</w:t>
+      </w:r>
+    </w:p>
+    <w:p>
+      <w:pPr>
+        <w:spacing w:before="60" w:after="60"/>
+      </w:pPr>
+    </w:p>
+    <w:p>
+      <w:pPr>
+        <w:spacing w:before="60" w:after="60"/>
+      </w:pPr>
+      <w:r>
+        <w:t>plt.figure(figsize=(7, 5))</w:t>
+      </w:r>
+    </w:p>
+    <w:p>
+      <w:pPr>
+        <w:spacing w:before="60" w:after="60"/>
+      </w:pPr>
+      <w:r>
+        <w:t>sns.heatmap(corr, annot=True, fmt='.2f', cmap='coolwarm', linewidths=0.5)</w:t>
+      </w:r>
+    </w:p>
+    <w:p>
+      <w:pPr>
+        <w:spacing w:before="60" w:after="60"/>
+      </w:pPr>
+      <w:r>
+        <w:t>plt.title('Correlation Heatmap', fontsize=14, fontweight='bold')</w:t>
       </w:r>
     </w:p>
     <w:p>
@@ -3136,12 +2960,18 @@
       <w:pPr>
         <w:spacing w:before="60" w:after="60"/>
       </w:pPr>
-      <w:r>
+    </w:p>
+    <w:p>
+      <w:pPr>
+        <w:spacing w:before="60" w:after="60"/>
+      </w:pPr>
+      <w:r>
+        <w:lastRenderedPageBreak/>
         <w:drawing>
-          <wp:inline distT="0" distB="0" distL="0" distR="0" wp14:anchorId="3572D585" wp14:editId="576CC219">
-            <wp:extent cx="6172200" cy="3008630"/>
-            <wp:effectExtent l="0" t="0" r="0" b="1270"/>
-            <wp:docPr id="7" name="Picture 7"/>
+          <wp:inline distT="0" distB="0" distL="0" distR="0" wp14:anchorId="332D4214" wp14:editId="7AAAE02D">
+            <wp:extent cx="6172200" cy="4535170"/>
+            <wp:effectExtent l="0" t="0" r="0" b="0"/>
+            <wp:docPr id="9" name="Picture 9"/>
             <wp:cNvGraphicFramePr>
               <a:graphicFrameLocks xmlns:a="http://schemas.openxmlformats.org/drawingml/2006/main" noChangeAspect="1"/>
             </wp:cNvGraphicFramePr>
@@ -3161,7 +2991,7 @@
                   <pic:spPr>
                     <a:xfrm>
                       <a:off x="0" y="0"/>
-                      <a:ext cx="6172200" cy="3008630"/>
+                      <a:ext cx="6172200" cy="4535170"/>
                     </a:xfrm>
                     <a:prstGeom prst="rect">
                       <a:avLst/>
@@ -3183,54 +3013,106 @@
       <w:pPr>
         <w:spacing w:before="60" w:after="60"/>
       </w:pPr>
-      <w:r>
-        <w:t>sample = df[df['UnitPrice'] &lt; df['UnitPrice'].quantile(0.95)].sample(3000, random_state=42)</w:t>
-      </w:r>
-    </w:p>
-    <w:p>
-      <w:pPr>
-        <w:spacing w:before="60" w:after="60"/>
-      </w:pPr>
-    </w:p>
-    <w:p>
-      <w:pPr>
-        <w:spacing w:before="60" w:after="60"/>
-      </w:pPr>
-      <w:r>
-        <w:t>plt.figure(figsize=(10, 5))</w:t>
-      </w:r>
-    </w:p>
-    <w:p>
-      <w:pPr>
-        <w:spacing w:before="60" w:after="60"/>
-      </w:pPr>
-      <w:r>
-        <w:t>sns.scatterplot(data=sample, x='UnitPrice', y='Revenue', alpha=0.4, color='teal')</w:t>
-      </w:r>
-    </w:p>
-    <w:p>
-      <w:pPr>
-        <w:spacing w:before="60" w:after="60"/>
-      </w:pPr>
-      <w:r>
-        <w:t>plt.title('Unit Price vs Revenue', fontsize=14, fontweight='bold')</w:t>
-      </w:r>
-    </w:p>
-    <w:p>
-      <w:pPr>
-        <w:spacing w:before="60" w:after="60"/>
-      </w:pPr>
-      <w:r>
-        <w:t>plt.xlabel('Unit Price (£)')</w:t>
-      </w:r>
-    </w:p>
-    <w:p>
-      <w:pPr>
-        <w:spacing w:before="60" w:after="60"/>
-      </w:pPr>
-      <w:r>
-        <w:t>plt.ylabel('Revenue (£)')</w:t>
-      </w:r>
+    </w:p>
+    <w:p>
+      <w:pPr>
+        <w:spacing w:before="60" w:after="60"/>
+      </w:pPr>
+      <w:r>
+        <w:t>fig, axes = plt.subplots(1, 2, figsize=(14, 5))</w:t>
+      </w:r>
+    </w:p>
+    <w:p>
+      <w:pPr>
+        <w:spacing w:before="60" w:after="60"/>
+      </w:pPr>
+    </w:p>
+    <w:p>
+      <w:pPr>
+        <w:spacing w:before="60" w:after="60"/>
+      </w:pPr>
+      <w:r>
+        <w:t># Cap at 99th percentile for visibility</w:t>
+      </w:r>
+    </w:p>
+    <w:p>
+      <w:pPr>
+        <w:spacing w:before="60" w:after="60"/>
+      </w:pPr>
+      <w:r>
+        <w:t>rev_cap = df['Revenue'].clip(upper=df['Revenue'].quantile(0.99))</w:t>
+      </w:r>
+    </w:p>
+    <w:p>
+      <w:pPr>
+        <w:spacing w:before="60" w:after="60"/>
+      </w:pPr>
+      <w:r>
+        <w:t>qty_cap = df['Quantity'].clip(upper=df['Quantity'].quantile(0.99))</w:t>
+      </w:r>
+    </w:p>
+    <w:p>
+      <w:pPr>
+        <w:spacing w:before="60" w:after="60"/>
+      </w:pPr>
+    </w:p>
+    <w:p>
+      <w:pPr>
+        <w:spacing w:before="60" w:after="60"/>
+      </w:pPr>
+      <w:r>
+        <w:t>sns.boxplot(y=rev_cap, ax=axes[0], color='lightcoral')</w:t>
+      </w:r>
+    </w:p>
+    <w:p>
+      <w:pPr>
+        <w:spacing w:before="60" w:after="60"/>
+      </w:pPr>
+      <w:r>
+        <w:t>axes[0].set_title('Revenue Distribution (Box Plot)', fontweight='bold')</w:t>
+      </w:r>
+    </w:p>
+    <w:p>
+      <w:pPr>
+        <w:spacing w:before="60" w:after="60"/>
+      </w:pPr>
+      <w:r>
+        <w:t>axes[0].set_ylabel('Revenue (£)')</w:t>
+      </w:r>
+    </w:p>
+    <w:p>
+      <w:pPr>
+        <w:spacing w:before="60" w:after="60"/>
+      </w:pPr>
+    </w:p>
+    <w:p>
+      <w:pPr>
+        <w:spacing w:before="60" w:after="60"/>
+      </w:pPr>
+      <w:r>
+        <w:t>sns.boxplot(y=qty_cap, ax=axes[1], color='lightblue')</w:t>
+      </w:r>
+    </w:p>
+    <w:p>
+      <w:pPr>
+        <w:spacing w:before="60" w:after="60"/>
+      </w:pPr>
+      <w:r>
+        <w:t>axes[1].set_title('Quantity Distribution (Box Plot)', fontweight='bold')</w:t>
+      </w:r>
+    </w:p>
+    <w:p>
+      <w:pPr>
+        <w:spacing w:before="60" w:after="60"/>
+      </w:pPr>
+      <w:r>
+        <w:t>axes[1].set_ylabel('Quantity')</w:t>
+      </w:r>
+    </w:p>
+    <w:p>
+      <w:pPr>
+        <w:spacing w:before="60" w:after="60"/>
+      </w:pPr>
     </w:p>
     <w:p>
       <w:pPr>
@@ -3259,10 +3141,10 @@
       </w:pPr>
       <w:r>
         <w:drawing>
-          <wp:inline distT="0" distB="0" distL="0" distR="0" wp14:anchorId="3B70BFEA" wp14:editId="3C69BA5A">
-            <wp:extent cx="6172200" cy="3008630"/>
-            <wp:effectExtent l="0" t="0" r="0" b="1270"/>
-            <wp:docPr id="6" name="Picture 6"/>
+          <wp:inline distT="0" distB="0" distL="0" distR="0" wp14:anchorId="56F70862" wp14:editId="01F3ED0F">
+            <wp:extent cx="6172200" cy="2205990"/>
+            <wp:effectExtent l="0" t="0" r="0" b="3810"/>
+            <wp:docPr id="8" name="Picture 8"/>
             <wp:cNvGraphicFramePr>
               <a:graphicFrameLocks xmlns:a="http://schemas.openxmlformats.org/drawingml/2006/main" noChangeAspect="1"/>
             </wp:cNvGraphicFramePr>
@@ -3282,6 +3164,251 @@
                   <pic:spPr>
                     <a:xfrm>
                       <a:off x="0" y="0"/>
+                      <a:ext cx="6172200" cy="2205990"/>
+                    </a:xfrm>
+                    <a:prstGeom prst="rect">
+                      <a:avLst/>
+                    </a:prstGeom>
+                  </pic:spPr>
+                </pic:pic>
+              </a:graphicData>
+            </a:graphic>
+          </wp:inline>
+        </w:drawing>
+      </w:r>
+    </w:p>
+    <w:p>
+      <w:pPr>
+        <w:spacing w:before="60" w:after="60"/>
+      </w:pPr>
+    </w:p>
+    <w:p>
+      <w:pPr>
+        <w:spacing w:before="60" w:after="60"/>
+      </w:pPr>
+      <w:r>
+        <w:t>day_order = ['Monday','Tuesday','Wednesday','Thursday','Friday','Saturday','Sunday']</w:t>
+      </w:r>
+    </w:p>
+    <w:p>
+      <w:pPr>
+        <w:spacing w:before="60" w:after="60"/>
+      </w:pPr>
+      <w:r>
+        <w:t>day_sales = df.groupby('DayOfWeek')['Revenue'].sum().reindex(day_order)</w:t>
+      </w:r>
+    </w:p>
+    <w:p>
+      <w:pPr>
+        <w:spacing w:before="60" w:after="60"/>
+      </w:pPr>
+    </w:p>
+    <w:p>
+      <w:pPr>
+        <w:spacing w:before="60" w:after="60"/>
+      </w:pPr>
+      <w:r>
+        <w:t>plt.figure(figsize=(10, 5))</w:t>
+      </w:r>
+    </w:p>
+    <w:p>
+      <w:pPr>
+        <w:spacing w:before="60" w:after="60"/>
+      </w:pPr>
+      <w:r>
+        <w:t>sns.barplot(x=day_sales.index, y=day_sales.values, palette='Set2')</w:t>
+      </w:r>
+    </w:p>
+    <w:p>
+      <w:pPr>
+        <w:spacing w:before="60" w:after="60"/>
+      </w:pPr>
+      <w:r>
+        <w:t>plt.title('Revenue by Day of Week', fontsize=14, fontweight='bold')</w:t>
+      </w:r>
+    </w:p>
+    <w:p>
+      <w:pPr>
+        <w:spacing w:before="60" w:after="60"/>
+      </w:pPr>
+      <w:r>
+        <w:t>plt.xlabel('Day')</w:t>
+      </w:r>
+    </w:p>
+    <w:p>
+      <w:pPr>
+        <w:spacing w:before="60" w:after="60"/>
+      </w:pPr>
+      <w:r>
+        <w:t>plt.ylabel('Total Revenue (£)')</w:t>
+      </w:r>
+    </w:p>
+    <w:p>
+      <w:pPr>
+        <w:spacing w:before="60" w:after="60"/>
+      </w:pPr>
+      <w:r>
+        <w:t>plt.tight_layout()</w:t>
+      </w:r>
+    </w:p>
+    <w:p>
+      <w:pPr>
+        <w:spacing w:before="60" w:after="60"/>
+      </w:pPr>
+      <w:r>
+        <w:t>plt.show()</w:t>
+      </w:r>
+    </w:p>
+    <w:p>
+      <w:pPr>
+        <w:spacing w:before="60" w:after="60"/>
+      </w:pPr>
+      <w:r>
+        <w:drawing>
+          <wp:inline distT="0" distB="0" distL="0" distR="0" wp14:anchorId="3572D585" wp14:editId="576CC219">
+            <wp:extent cx="6172200" cy="3008630"/>
+            <wp:effectExtent l="0" t="0" r="0" b="1270"/>
+            <wp:docPr id="7" name="Picture 7"/>
+            <wp:cNvGraphicFramePr>
+              <a:graphicFrameLocks xmlns:a="http://schemas.openxmlformats.org/drawingml/2006/main" noChangeAspect="1"/>
+            </wp:cNvGraphicFramePr>
+            <a:graphic xmlns:a="http://schemas.openxmlformats.org/drawingml/2006/main">
+              <a:graphicData uri="http://schemas.openxmlformats.org/drawingml/2006/picture">
+                <pic:pic xmlns:pic="http://schemas.openxmlformats.org/drawingml/2006/picture">
+                  <pic:nvPicPr>
+                    <pic:cNvPr id="1" name=""/>
+                    <pic:cNvPicPr/>
+                  </pic:nvPicPr>
+                  <pic:blipFill>
+                    <a:blip r:embed="rId13"/>
+                    <a:stretch>
+                      <a:fillRect/>
+                    </a:stretch>
+                  </pic:blipFill>
+                  <pic:spPr>
+                    <a:xfrm>
+                      <a:off x="0" y="0"/>
+                      <a:ext cx="6172200" cy="3008630"/>
+                    </a:xfrm>
+                    <a:prstGeom prst="rect">
+                      <a:avLst/>
+                    </a:prstGeom>
+                  </pic:spPr>
+                </pic:pic>
+              </a:graphicData>
+            </a:graphic>
+          </wp:inline>
+        </w:drawing>
+      </w:r>
+    </w:p>
+    <w:p>
+      <w:pPr>
+        <w:spacing w:before="60" w:after="60"/>
+      </w:pPr>
+    </w:p>
+    <w:p>
+      <w:pPr>
+        <w:spacing w:before="60" w:after="60"/>
+      </w:pPr>
+      <w:r>
+        <w:t>sample = df[df['UnitPrice'] &lt; df['UnitPrice'].quantile(0.95)].sample(3000, random_state=42)</w:t>
+      </w:r>
+    </w:p>
+    <w:p>
+      <w:pPr>
+        <w:spacing w:before="60" w:after="60"/>
+      </w:pPr>
+    </w:p>
+    <w:p>
+      <w:pPr>
+        <w:spacing w:before="60" w:after="60"/>
+      </w:pPr>
+      <w:r>
+        <w:t>plt.figure(figsize=(10, 5))</w:t>
+      </w:r>
+    </w:p>
+    <w:p>
+      <w:pPr>
+        <w:spacing w:before="60" w:after="60"/>
+      </w:pPr>
+      <w:r>
+        <w:t>sns.scatterplot(data=sample, x='UnitPrice', y='Revenue', alpha=0.4, color='teal')</w:t>
+      </w:r>
+    </w:p>
+    <w:p>
+      <w:pPr>
+        <w:spacing w:before="60" w:after="60"/>
+      </w:pPr>
+      <w:r>
+        <w:t>plt.title('Unit Price vs Revenue', fontsize=14, fontweight='bold')</w:t>
+      </w:r>
+    </w:p>
+    <w:p>
+      <w:pPr>
+        <w:spacing w:before="60" w:after="60"/>
+      </w:pPr>
+      <w:r>
+        <w:t>plt.xlabel('Unit Price (£)')</w:t>
+      </w:r>
+    </w:p>
+    <w:p>
+      <w:pPr>
+        <w:spacing w:before="60" w:after="60"/>
+      </w:pPr>
+      <w:r>
+        <w:t>plt.ylabel('Revenue (£)')</w:t>
+      </w:r>
+    </w:p>
+    <w:p>
+      <w:pPr>
+        <w:spacing w:before="60" w:after="60"/>
+      </w:pPr>
+      <w:r>
+        <w:t>plt.tight_layout()</w:t>
+      </w:r>
+    </w:p>
+    <w:p>
+      <w:pPr>
+        <w:spacing w:before="60" w:after="60"/>
+      </w:pPr>
+      <w:r>
+        <w:t>plt.show()</w:t>
+      </w:r>
+    </w:p>
+    <w:p>
+      <w:pPr>
+        <w:spacing w:before="60" w:after="60"/>
+      </w:pPr>
+    </w:p>
+    <w:p>
+      <w:pPr>
+        <w:spacing w:before="60" w:after="60"/>
+      </w:pPr>
+      <w:r>
+        <w:drawing>
+          <wp:inline distT="0" distB="0" distL="0" distR="0" wp14:anchorId="3B70BFEA" wp14:editId="3C69BA5A">
+            <wp:extent cx="6172200" cy="3008630"/>
+            <wp:effectExtent l="0" t="0" r="0" b="1270"/>
+            <wp:docPr id="6" name="Picture 6"/>
+            <wp:cNvGraphicFramePr>
+              <a:graphicFrameLocks xmlns:a="http://schemas.openxmlformats.org/drawingml/2006/main" noChangeAspect="1"/>
+            </wp:cNvGraphicFramePr>
+            <a:graphic xmlns:a="http://schemas.openxmlformats.org/drawingml/2006/main">
+              <a:graphicData uri="http://schemas.openxmlformats.org/drawingml/2006/picture">
+                <pic:pic xmlns:pic="http://schemas.openxmlformats.org/drawingml/2006/picture">
+                  <pic:nvPicPr>
+                    <pic:cNvPr id="1" name=""/>
+                    <pic:cNvPicPr/>
+                  </pic:nvPicPr>
+                  <pic:blipFill>
+                    <a:blip r:embed="rId14"/>
+                    <a:stretch>
+                      <a:fillRect/>
+                    </a:stretch>
+                  </pic:blipFill>
+                  <pic:spPr>
+                    <a:xfrm>
+                      <a:off x="0" y="0"/>
                       <a:ext cx="6172200" cy="3008630"/>
                     </a:xfrm>
                     <a:prstGeom prst="rect">
@@ -3659,7 +3786,7 @@
                     <pic:cNvPicPr/>
                   </pic:nvPicPr>
                   <pic:blipFill>
-                    <a:blip r:embed="rId13"/>
+                    <a:blip r:embed="rId15"/>
                     <a:stretch>
                       <a:fillRect/>
                     </a:stretch>
@@ -3841,7 +3968,7 @@
                     <pic:cNvPicPr/>
                   </pic:nvPicPr>
                   <pic:blipFill>
-                    <a:blip r:embed="rId14"/>
+                    <a:blip r:embed="rId16"/>
                     <a:stretch>
                       <a:fillRect/>
                     </a:stretch>
@@ -3970,7 +4097,7 @@
                     <pic:cNvPicPr/>
                   </pic:nvPicPr>
                   <pic:blipFill>
-                    <a:blip r:embed="rId15"/>
+                    <a:blip r:embed="rId17"/>
                     <a:stretch>
                       <a:fillRect/>
                     </a:stretch>
@@ -4180,7 +4307,7 @@
                     <pic:cNvPicPr/>
                   </pic:nvPicPr>
                   <pic:blipFill>
-                    <a:blip r:embed="rId16"/>
+                    <a:blip r:embed="rId18"/>
                     <a:stretch>
                       <a:fillRect/>
                     </a:stretch>
@@ -5175,7 +5302,7 @@
       <w:r>
         <w:t xml:space="preserve">[8]  NumPy Documentation: </w:t>
       </w:r>
-      <w:hyperlink r:id="rId17" w:history="1">
+      <w:hyperlink r:id="rId19" w:history="1">
         <w:r>
           <w:rPr>
             <w:rStyle w:val="Hyperlink"/>

</xml_diff>